<commit_message>
feat(resume): embed verified live demo and GitHub source links for Aegis and Gridium
</commit_message>
<xml_diff>
--- a/Shaunak_Rane_Resume.docx
+++ b/Shaunak_Rane_Resume.docx
@@ -32,7 +32,7 @@
     </w:p>
     <w:p>
       <w:pPr>
-        <w:spacing w:before="0" w:after="80" w:line="264" w:lineRule="auto"/>
+        <w:spacing w:before="0" w:after="70" w:line="264" w:lineRule="auto"/>
         <w:jc w:val="center"/>
       </w:pPr>
       <w:r>
@@ -45,7 +45,7 @@
     </w:p>
     <w:p>
       <w:pPr>
-        <w:spacing w:before="100" w:after="50" w:line="264" w:lineRule="auto"/>
+        <w:spacing w:before="90" w:after="40" w:line="264" w:lineRule="auto"/>
         <w:jc w:val="left"/>
         <w:pBdr>
           <w:bottom w:val="single" w:sz="6" w:space="1" w:color="000000"/>
@@ -56,14 +56,14 @@
           <w:rFonts w:ascii="Arial" w:hAnsi="Arial"/>
           <w:b/>
           <w:color w:val="000000"/>
-          <w:sz w:val="20"/>
+          <w:sz w:val="19"/>
         </w:rPr>
         <w:t>PROFESSIONAL SUMMARY</w:t>
       </w:r>
     </w:p>
     <w:p>
       <w:pPr>
-        <w:spacing w:before="0" w:after="70" w:line="264" w:lineRule="auto"/>
+        <w:spacing w:before="0" w:after="60" w:line="264" w:lineRule="auto"/>
         <w:jc w:val="left"/>
       </w:pPr>
       <w:r>
@@ -76,7 +76,7 @@
     </w:p>
     <w:p>
       <w:pPr>
-        <w:spacing w:before="100" w:after="50" w:line="264" w:lineRule="auto"/>
+        <w:spacing w:before="90" w:after="40" w:line="264" w:lineRule="auto"/>
         <w:jc w:val="left"/>
         <w:pBdr>
           <w:bottom w:val="single" w:sz="6" w:space="1" w:color="000000"/>
@@ -87,14 +87,14 @@
           <w:rFonts w:ascii="Arial" w:hAnsi="Arial"/>
           <w:b/>
           <w:color w:val="000000"/>
-          <w:sz w:val="20"/>
+          <w:sz w:val="19"/>
         </w:rPr>
         <w:t>TECHNICAL SKILLS</w:t>
       </w:r>
     </w:p>
     <w:p>
       <w:pPr>
-        <w:spacing w:before="0" w:after="24" w:line="264" w:lineRule="auto"/>
+        <w:spacing w:before="0" w:after="20" w:line="264" w:lineRule="auto"/>
         <w:jc w:val="left"/>
       </w:pPr>
       <w:r>
@@ -115,7 +115,7 @@
     </w:p>
     <w:p>
       <w:pPr>
-        <w:spacing w:before="0" w:after="24" w:line="264" w:lineRule="auto"/>
+        <w:spacing w:before="0" w:after="20" w:line="264" w:lineRule="auto"/>
         <w:jc w:val="left"/>
       </w:pPr>
       <w:r>
@@ -136,7 +136,7 @@
     </w:p>
     <w:p>
       <w:pPr>
-        <w:spacing w:before="0" w:after="24" w:line="264" w:lineRule="auto"/>
+        <w:spacing w:before="0" w:after="20" w:line="264" w:lineRule="auto"/>
         <w:jc w:val="left"/>
       </w:pPr>
       <w:r>
@@ -157,7 +157,7 @@
     </w:p>
     <w:p>
       <w:pPr>
-        <w:spacing w:before="0" w:after="24" w:line="264" w:lineRule="auto"/>
+        <w:spacing w:before="0" w:after="20" w:line="264" w:lineRule="auto"/>
         <w:jc w:val="left"/>
       </w:pPr>
       <w:r>
@@ -178,7 +178,7 @@
     </w:p>
     <w:p>
       <w:pPr>
-        <w:spacing w:before="0" w:after="24" w:line="264" w:lineRule="auto"/>
+        <w:spacing w:before="0" w:after="20" w:line="264" w:lineRule="auto"/>
         <w:jc w:val="left"/>
       </w:pPr>
       <w:r>
@@ -199,7 +199,7 @@
     </w:p>
     <w:p>
       <w:pPr>
-        <w:spacing w:before="100" w:after="50" w:line="264" w:lineRule="auto"/>
+        <w:spacing w:before="90" w:after="40" w:line="264" w:lineRule="auto"/>
         <w:jc w:val="left"/>
         <w:pBdr>
           <w:bottom w:val="single" w:sz="6" w:space="1" w:color="000000"/>
@@ -210,7 +210,7 @@
           <w:rFonts w:ascii="Arial" w:hAnsi="Arial"/>
           <w:b/>
           <w:color w:val="000000"/>
-          <w:sz w:val="20"/>
+          <w:sz w:val="19"/>
         </w:rPr>
         <w:t>WORK EXPERIENCE</w:t>
       </w:r>
@@ -240,7 +240,7 @@
         <w:rPr>
           <w:rFonts w:ascii="Arial" w:hAnsi="Arial"/>
           <w:b/>
-          <w:sz w:val="17"/>
+          <w:sz w:val="16"/>
         </w:rPr>
         <w:t xml:space="preserve">       (May 2026 - Aug 2026 | Thane, India (Remote))</w:t>
       </w:r>
@@ -322,7 +322,7 @@
         <w:rPr>
           <w:rFonts w:ascii="Arial" w:hAnsi="Arial"/>
           <w:b/>
-          <w:sz w:val="17"/>
+          <w:sz w:val="16"/>
         </w:rPr>
         <w:t xml:space="preserve">       (Apr 2025 - Jul 2025 | Thane, India (Remote))</w:t>
       </w:r>
@@ -381,7 +381,7 @@
     </w:p>
     <w:p>
       <w:pPr>
-        <w:spacing w:before="100" w:after="50" w:line="264" w:lineRule="auto"/>
+        <w:spacing w:before="90" w:after="40" w:line="264" w:lineRule="auto"/>
         <w:jc w:val="left"/>
         <w:pBdr>
           <w:bottom w:val="single" w:sz="6" w:space="1" w:color="000000"/>
@@ -392,14 +392,14 @@
           <w:rFonts w:ascii="Arial" w:hAnsi="Arial"/>
           <w:b/>
           <w:color w:val="000000"/>
-          <w:sz w:val="20"/>
+          <w:sz w:val="19"/>
         </w:rPr>
         <w:t>PROJECTS</w:t>
       </w:r>
     </w:p>
     <w:p>
       <w:pPr>
-        <w:spacing w:before="40" w:after="20" w:line="264" w:lineRule="auto"/>
+        <w:spacing w:before="40" w:after="10" w:line="264" w:lineRule="auto"/>
         <w:jc w:val="left"/>
       </w:pPr>
       <w:r>
@@ -414,9 +414,47 @@
         <w:rPr>
           <w:rFonts w:ascii="Arial" w:hAnsi="Arial"/>
           <w:i/>
-          <w:sz w:val="17"/>
+          <w:sz w:val="16"/>
         </w:rPr>
         <w:t xml:space="preserve"> | Python, FastAPI, Agentic AI, RAG, Supabase (pgvector), Docker</w:t>
+      </w:r>
+    </w:p>
+    <w:p>
+      <w:pPr>
+        <w:spacing w:before="0" w:after="20" w:line="264" w:lineRule="auto"/>
+        <w:jc w:val="left"/>
+      </w:pPr>
+      <w:r>
+        <w:rPr>
+          <w:rFonts w:ascii="Arial" w:hAnsi="Arial"/>
+          <w:b/>
+          <w:sz w:val="16"/>
+        </w:rPr>
+        <w:t xml:space="preserve">Live Demo: </w:t>
+      </w:r>
+      <w:r>
+        <w:rPr>
+          <w:rFonts w:ascii="Arial" w:hAnsi="Arial"/>
+          <w:sz w:val="16"/>
+          <w:u w:val="single"/>
+        </w:rPr>
+        <w:t xml:space="preserve">https://agenticai914.netlify.app   </w:t>
+      </w:r>
+      <w:r>
+        <w:rPr>
+          <w:rFonts w:ascii="Arial" w:hAnsi="Arial"/>
+          <w:b/>
+          <w:sz w:val="16"/>
+        </w:rPr>
+        <w:t xml:space="preserve">Source Code: </w:t>
+      </w:r>
+      <w:r>
+        <w:rPr>
+          <w:rFonts w:ascii="Arial" w:hAnsi="Arial"/>
+          <w:sz w:val="16"/>
+          <w:u w:val="single"/>
+        </w:rPr>
+        <w:t xml:space="preserve">https://github.com/Shaunakrane914/Misinformation   </w:t>
       </w:r>
     </w:p>
     <w:p>
@@ -460,7 +498,7 @@
     </w:p>
     <w:p>
       <w:pPr>
-        <w:spacing w:before="40" w:after="20" w:line="264" w:lineRule="auto"/>
+        <w:spacing w:before="40" w:after="10" w:line="264" w:lineRule="auto"/>
         <w:jc w:val="left"/>
       </w:pPr>
       <w:r>
@@ -475,9 +513,47 @@
         <w:rPr>
           <w:rFonts w:ascii="Arial" w:hAnsi="Arial"/>
           <w:i/>
-          <w:sz w:val="17"/>
+          <w:sz w:val="16"/>
         </w:rPr>
         <w:t xml:space="preserve"> | Python, PyTorch, FastAPI, DDPG, WebSockets</w:t>
+      </w:r>
+    </w:p>
+    <w:p>
+      <w:pPr>
+        <w:spacing w:before="0" w:after="20" w:line="264" w:lineRule="auto"/>
+        <w:jc w:val="left"/>
+      </w:pPr>
+      <w:r>
+        <w:rPr>
+          <w:rFonts w:ascii="Arial" w:hAnsi="Arial"/>
+          <w:b/>
+          <w:sz w:val="16"/>
+        </w:rPr>
+        <w:t xml:space="preserve">Live Demo: </w:t>
+      </w:r>
+      <w:r>
+        <w:rPr>
+          <w:rFonts w:ascii="Arial" w:hAnsi="Arial"/>
+          <w:sz w:val="16"/>
+          <w:u w:val="single"/>
+        </w:rPr>
+        <w:t xml:space="preserve">https://live-ai-1-7tcy.vercel.app   </w:t>
+      </w:r>
+      <w:r>
+        <w:rPr>
+          <w:rFonts w:ascii="Arial" w:hAnsi="Arial"/>
+          <w:b/>
+          <w:sz w:val="16"/>
+        </w:rPr>
+        <w:t xml:space="preserve">Source Code: </w:t>
+      </w:r>
+      <w:r>
+        <w:rPr>
+          <w:rFonts w:ascii="Arial" w:hAnsi="Arial"/>
+          <w:sz w:val="16"/>
+          <w:u w:val="single"/>
+        </w:rPr>
+        <w:t xml:space="preserve">https://github.com/Shaunakrane914/Live-Ai-1   </w:t>
       </w:r>
     </w:p>
     <w:p>
@@ -521,7 +597,7 @@
     </w:p>
     <w:p>
       <w:pPr>
-        <w:spacing w:before="40" w:after="20" w:line="264" w:lineRule="auto"/>
+        <w:spacing w:before="40" w:after="10" w:line="264" w:lineRule="auto"/>
         <w:jc w:val="left"/>
       </w:pPr>
       <w:r>
@@ -536,9 +612,31 @@
         <w:rPr>
           <w:rFonts w:ascii="Arial" w:hAnsi="Arial"/>
           <w:i/>
-          <w:sz w:val="17"/>
+          <w:sz w:val="16"/>
         </w:rPr>
         <w:t xml:space="preserve"> | Python, PyTorch Geometric, GraphSAGE, FastAPI</w:t>
+      </w:r>
+    </w:p>
+    <w:p>
+      <w:pPr>
+        <w:spacing w:before="0" w:after="20" w:line="264" w:lineRule="auto"/>
+        <w:jc w:val="left"/>
+      </w:pPr>
+      <w:r>
+        <w:rPr>
+          <w:rFonts w:ascii="Arial" w:hAnsi="Arial"/>
+          <w:b/>
+          <w:sz w:val="16"/>
+        </w:rPr>
+        <w:t xml:space="preserve">Source Code: </w:t>
+      </w:r>
+      <w:r>
+        <w:rPr>
+          <w:rFonts w:ascii="Arial" w:hAnsi="Arial"/>
+          <w:sz w:val="16"/>
+          <w:u w:val="single"/>
+        </w:rPr>
+        <w:t xml:space="preserve">https://github.com/Shaunakrane914/Flow   </w:t>
       </w:r>
     </w:p>
     <w:p>
@@ -582,7 +680,7 @@
     </w:p>
     <w:p>
       <w:pPr>
-        <w:spacing w:before="100" w:after="50" w:line="264" w:lineRule="auto"/>
+        <w:spacing w:before="90" w:after="40" w:line="264" w:lineRule="auto"/>
         <w:jc w:val="left"/>
         <w:pBdr>
           <w:bottom w:val="single" w:sz="6" w:space="1" w:color="000000"/>
@@ -593,7 +691,7 @@
           <w:rFonts w:ascii="Arial" w:hAnsi="Arial"/>
           <w:b/>
           <w:color w:val="000000"/>
-          <w:sz w:val="20"/>
+          <w:sz w:val="19"/>
         </w:rPr>
         <w:t>EDUCATION</w:t>
       </w:r>
@@ -622,7 +720,7 @@
         <w:rPr>
           <w:rFonts w:ascii="Arial" w:hAnsi="Arial"/>
           <w:b/>
-          <w:sz w:val="17"/>
+          <w:sz w:val="16"/>
         </w:rPr>
         <w:t xml:space="preserve">       (Expected May 2028 | Karjat, Maharashtra)</w:t>
       </w:r>
@@ -650,7 +748,7 @@
     </w:p>
     <w:sectPr>
       <w:pgSz w:w="12240" w:h="15840"/>
-      <w:pgMar w:top="518" w:right="605" w:bottom="504" w:left="605" w:header="720" w:footer="720" w:gutter="0"/>
+      <w:pgMar w:top="475" w:right="605" w:bottom="432" w:left="605" w:header="720" w:footer="720" w:gutter="0"/>
       <w:cols w:space="720"/>
       <w:docGrid w:linePitch="360"/>
     </w:sectPr>

</xml_diff>

<commit_message>
feat(resume): align summary and skills to Accenture Technology Analyst internship requirements
</commit_message>
<xml_diff>
--- a/Shaunak_Rane_Resume.docx
+++ b/Shaunak_Rane_Resume.docx
@@ -71,7 +71,7 @@
           <w:rFonts w:ascii="Arial" w:hAnsi="Arial"/>
           <w:sz w:val="17"/>
         </w:rPr>
-        <w:t>AI Engineer with proven experience architecting autonomous multi-agent systems, structured output generation pipelines via LLM APIs, and production-grade RAG retrieval systems. Strong foundation in software engineering fundamentals, object-oriented design, and containerized REST microservices using FastAPI, PostgreSQL, and Docker. Hands-on background developing predictive time-series models for mission-critical industrial assets, with end-to-end focus on API observability, regression testing, and reproducible system promotion.</w:t>
+        <w:t>AI and software engineering intern with proven experience delivering end-to-end solutions across full Software Development Lifecycle (SDLC): from requirements analysis and system design to implementation, testing, and deployment. Strong analytical and problem-solving skills applied to real client workloads, autonomous multi-agent systems, LLM API pipelines, and production-grade machine learning services. Collaborative team contributor with hands-on background in Python, REST APIs, SQL databases, Docker, and automated test engineering.</w:t>
       </w:r>
     </w:p>
     <w:p>
@@ -131,7 +131,7 @@
           <w:rFonts w:ascii="Arial" w:hAnsi="Arial"/>
           <w:sz w:val="17"/>
         </w:rPr>
-        <w:t>PyTorch, PyTorch Geometric, Graph Neural Networks (GraphSAGE), Scikit-learn, Statsmodels, Time-Series Modeling, Anomaly Detection, NumPy, Pandas</w:t>
+        <w:t>PyTorch, PyTorch Geometric, GraphSAGE, Scikit-learn, Statsmodels, NumPy, Pandas, Exploratory Data Analysis, Time-Series Modeling, Anomaly Detection</w:t>
       </w:r>
     </w:p>
     <w:p>
@@ -152,7 +152,7 @@
           <w:rFonts w:ascii="Arial" w:hAnsi="Arial"/>
           <w:sz w:val="17"/>
         </w:rPr>
-        <w:t>Python, C, SQL, TypeScript/JavaScript, FastAPI, Flask, RESTful APIs, WebSockets, OOP, System Architecture</w:t>
+        <w:t>Python, C, SQL, TypeScript/JavaScript, FastAPI, Flask, RESTful APIs, WebSockets, OOP, SDLC, System Design</w:t>
       </w:r>
     </w:p>
     <w:p>
@@ -194,7 +194,7 @@
           <w:rFonts w:ascii="Arial" w:hAnsi="Arial"/>
           <w:sz w:val="17"/>
         </w:rPr>
-        <w:t>Causal Evaluation, Statistical Quality Gates, API Observability, Test-Driven Development (TDD), Microservices</w:t>
+        <w:t>Full SDLC, Test-Driven Development (TDD), Causal Evaluation, API Observability, Agile Collaboration, Microservices, Documentation</w:t>
       </w:r>
     </w:p>
     <w:p>

</xml_diff>

<commit_message>
Align resume profile for consulting and tech internships with CGPA and balanced page geometry
</commit_message>
<xml_diff>
--- a/Shaunak_Rane_Resume.docx
+++ b/Shaunak_Rane_Resume.docx
@@ -27,7 +27,7 @@
           <w:b/>
           <w:sz w:val="19"/>
         </w:rPr>
-        <w:t>Associate AI Engineer | Agentic AI | LLM Systems | AI Automation</w:t>
+        <w:t>AI/ML Engineer | Backend &amp; LLM Systems | Python | FastAPI</w:t>
       </w:r>
     </w:p>
     <w:p>
@@ -281,7 +281,7 @@
           <w:rFonts w:ascii="Arial" w:hAnsi="Arial"/>
           <w:sz w:val="17"/>
         </w:rPr>
-        <w:t>Built and containerized REST inference microservices in Docker with Flask, automating anomaly detection alerts and cutting operational diagnostic turnaround.</w:t>
+        <w:t>Built and containerized REST inference microservices in Docker with Flask, automating anomaly detection alerts with structured API responses.</w:t>
       </w:r>
     </w:p>
     <w:p>
@@ -467,7 +467,7 @@
           <w:rFonts w:ascii="Arial" w:hAnsi="Arial"/>
           <w:sz w:val="17"/>
         </w:rPr>
-        <w:t>Architected an autonomous emergency response orchestrator with hybrid RAG retrieval and tool-calling agent swarms, enforcing strict JSON Schema validation for deterministic structured outputs.</w:t>
+        <w:t>Built a multi-agent incident-triage and response simulation with hybrid RAG retrieval and tool-calling agent swarms, enforcing strict JSON Schema validation for deterministic structured outputs.</w:t>
       </w:r>
     </w:p>
     <w:p>
@@ -480,7 +480,7 @@
           <w:rFonts w:ascii="Arial" w:hAnsi="Arial"/>
           <w:sz w:val="17"/>
         </w:rPr>
-        <w:t>Engineered tool-calling agent workflows to autonomously query incident records, evaluate casualty severity, and dispatch prioritized emergency actions with sub-second API latency.</w:t>
+        <w:t>Engineered tool-calling agent workflows to autonomously query incident records, evaluate severity levels, and route prioritized response actions across the multi-agent pipeline.</w:t>
       </w:r>
     </w:p>
     <w:p>
@@ -493,7 +493,7 @@
           <w:rFonts w:ascii="Arial" w:hAnsi="Arial"/>
           <w:sz w:val="17"/>
         </w:rPr>
-        <w:t>Implemented semantic vector persistence via Supabase (pgvector), API-key isolation, and structured audit trails for agent-to-agent message passing and real-time incident reporting.</w:t>
+        <w:t>Implemented semantic vector persistence via Supabase (pgvector), API-key isolation, and structured audit trails for agent-to-agent message passing and event reporting.</w:t>
       </w:r>
     </w:p>
     <w:p>
@@ -566,7 +566,7 @@
           <w:rFonts w:ascii="Arial" w:hAnsi="Arial"/>
           <w:sz w:val="17"/>
         </w:rPr>
-        <w:t>Developed a multi-agent reinforcement learning engine utilizing Deep Deterministic Policy Gradients (DDPG) to dynamically optimize power routing across a 15-node simulated grid.</w:t>
+        <w:t>Developed a multi-agent reinforcement learning engine utilizing Deep Deterministic Policy Gradients (DDPG) to dynamically optimize power routing across a 15-node simulated microgrid.</w:t>
       </w:r>
     </w:p>
     <w:p>
@@ -579,7 +579,7 @@
           <w:rFonts w:ascii="Arial" w:hAnsi="Arial"/>
           <w:sz w:val="17"/>
         </w:rPr>
-        <w:t>Coordinated decentralized agent policies managing solar generation, battery storage, and dynamic loads, achieving an 18.4% reduction in peak-hour grid strain.</w:t>
+        <w:t>Coordinated decentralized agent policies managing solar generation, battery storage, and dynamic loads, achieving an 18.4% reduction in peak-hour grid strain in simulation.</w:t>
       </w:r>
     </w:p>
     <w:p>
@@ -736,14 +736,29 @@
           <w:b/>
           <w:sz w:val="17"/>
         </w:rPr>
-        <w:t xml:space="preserve">Relevant Coursework: </w:t>
+        <w:t xml:space="preserve">CGPA: </w:t>
+      </w:r>
+      <w:r>
+        <w:rPr>
+          <w:rFonts w:ascii="Arial" w:hAnsi="Arial"/>
+          <w:b/>
+          <w:sz w:val="17"/>
+        </w:rPr>
+        <w:t>8.47</w:t>
       </w:r>
       <w:r>
         <w:rPr>
           <w:rFonts w:ascii="Arial" w:hAnsi="Arial"/>
           <w:sz w:val="17"/>
         </w:rPr>
-        <w:t>Data Structures &amp; Algorithms, Object-Oriented Programming (OOP), Machine Learning, Deep Learning, Database Management Systems (DBMS), Operating Systems, Linear Algebra &amp; Probability.</w:t>
+        <w:t xml:space="preserve">   |   Relevant Coursework: </w:t>
+      </w:r>
+      <w:r>
+        <w:rPr>
+          <w:rFonts w:ascii="Arial" w:hAnsi="Arial"/>
+          <w:sz w:val="17"/>
+        </w:rPr>
+        <w:t>Data Structures &amp; Algorithms, Object-Oriented Programming, Machine Learning, Deep Learning, DBMS, Operating Systems, Linear Algebra &amp; Probability.</w:t>
       </w:r>
     </w:p>
     <w:sectPr>

</xml_diff>

<commit_message>
refactor(resume): implement hiring critique - delete summary, ground metrics with baselines, evaluate Aegis, rank TopoFlow 2nd, and recompile single-page PDF/DOCX
</commit_message>
<xml_diff>
--- a/Shaunak_Rane_Resume.docx
+++ b/Shaunak_Rane_Resume.docx
@@ -58,38 +58,28 @@
           <w:color w:val="000000"/>
           <w:sz w:val="19"/>
         </w:rPr>
-        <w:t>PROFESSIONAL SUMMARY</w:t>
+        <w:t>TECHNICAL SKILLS</w:t>
       </w:r>
     </w:p>
     <w:p>
       <w:pPr>
-        <w:spacing w:before="0" w:after="60" w:line="264" w:lineRule="auto"/>
+        <w:spacing w:before="0" w:after="20" w:line="264" w:lineRule="auto"/>
         <w:jc w:val="left"/>
       </w:pPr>
       <w:r>
         <w:rPr>
           <w:rFonts w:ascii="Arial" w:hAnsi="Arial"/>
+          <w:b/>
           <w:sz w:val="17"/>
         </w:rPr>
-        <w:t>AI and software engineering intern with proven experience delivering end-to-end solutions across full Software Development Lifecycle (SDLC): from requirements analysis and system design to implementation, testing, and deployment. Strong analytical and problem-solving skills applied to real client workloads, autonomous multi-agent systems, LLM API pipelines, and production-grade machine learning services. Collaborative team contributor with hands-on background in Python, REST APIs, SQL databases, Docker, and automated test engineering.</w:t>
+        <w:t xml:space="preserve">Languages &amp; Core: </w:t>
       </w:r>
-    </w:p>
-    <w:p>
-      <w:pPr>
-        <w:spacing w:before="90" w:after="40" w:line="264" w:lineRule="auto"/>
-        <w:jc w:val="left"/>
-        <w:pBdr>
-          <w:bottom w:val="single" w:sz="6" w:space="1" w:color="000000"/>
-        </w:pBdr>
-      </w:pPr>
       <w:r>
         <w:rPr>
           <w:rFonts w:ascii="Arial" w:hAnsi="Arial"/>
-          <w:b/>
-          <w:color w:val="000000"/>
-          <w:sz w:val="19"/>
+          <w:sz w:val="17"/>
         </w:rPr>
-        <w:t>TECHNICAL SKILLS</w:t>
+        <w:t>Python, C, SQL, TypeScript/JavaScript, Bash, Linux, Git</w:t>
       </w:r>
     </w:p>
     <w:p>
@@ -110,7 +100,7 @@
           <w:rFonts w:ascii="Arial" w:hAnsi="Arial"/>
           <w:sz w:val="17"/>
         </w:rPr>
-        <w:t>Agentic AI, Multi-Agent Workflows, RAG, Prompt Engineering, Structured Outputs (JSON Schema), Function &amp; Tool Calling, Vector Embeddings, LLM APIs (Gemini, OpenAI)</w:t>
+        <w:t>Multi-Agent Workflows, RAG Architecture, Tool &amp; Function Calling, Structured Outputs (JSON Schema), Vector Embeddings (pgvector), Prompt Engineering, Gemini &amp; OpenAI APIs</w:t>
       </w:r>
     </w:p>
     <w:p>
@@ -131,7 +121,7 @@
           <w:rFonts w:ascii="Arial" w:hAnsi="Arial"/>
           <w:sz w:val="17"/>
         </w:rPr>
-        <w:t>PyTorch, PyTorch Geometric, GraphSAGE, Scikit-learn, Statsmodels, NumPy, Pandas, Exploratory Data Analysis, Time-Series Modeling, Anomaly Detection</w:t>
+        <w:t>PyTorch, PyTorch Geometric, GraphSAGE, Scikit-learn, Statsmodels, NumPy, Pandas, Time-Series Modeling, Anomaly Detection, Cross-Validation</w:t>
       </w:r>
     </w:p>
     <w:p>
@@ -145,56 +135,14 @@
           <w:b/>
           <w:sz w:val="17"/>
         </w:rPr>
-        <w:t xml:space="preserve">Backend &amp; Languages: </w:t>
+        <w:t xml:space="preserve">Backend &amp; Cloud/DevOps: </w:t>
       </w:r>
       <w:r>
         <w:rPr>
           <w:rFonts w:ascii="Arial" w:hAnsi="Arial"/>
           <w:sz w:val="17"/>
         </w:rPr>
-        <w:t>Python, C, SQL, TypeScript/JavaScript, FastAPI, Flask, RESTful APIs, WebSockets, OOP, SDLC, System Design</w:t>
-      </w:r>
-    </w:p>
-    <w:p>
-      <w:pPr>
-        <w:spacing w:before="0" w:after="20" w:line="264" w:lineRule="auto"/>
-        <w:jc w:val="left"/>
-      </w:pPr>
-      <w:r>
-        <w:rPr>
-          <w:rFonts w:ascii="Arial" w:hAnsi="Arial"/>
-          <w:b/>
-          <w:sz w:val="17"/>
-        </w:rPr>
-        <w:t xml:space="preserve">Databases &amp; DevOps: </w:t>
-      </w:r>
-      <w:r>
-        <w:rPr>
-          <w:rFonts w:ascii="Arial" w:hAnsi="Arial"/>
-          <w:sz w:val="17"/>
-        </w:rPr>
-        <w:t>PostgreSQL, Supabase (pgvector), MySQL, Docker, Git, GitHub Actions, Linux, Postman, pytest, CI/CD</w:t>
-      </w:r>
-    </w:p>
-    <w:p>
-      <w:pPr>
-        <w:spacing w:before="0" w:after="20" w:line="264" w:lineRule="auto"/>
-        <w:jc w:val="left"/>
-      </w:pPr>
-      <w:r>
-        <w:rPr>
-          <w:rFonts w:ascii="Arial" w:hAnsi="Arial"/>
-          <w:b/>
-          <w:sz w:val="17"/>
-        </w:rPr>
-        <w:t xml:space="preserve">Engineering Practices: </w:t>
-      </w:r>
-      <w:r>
-        <w:rPr>
-          <w:rFonts w:ascii="Arial" w:hAnsi="Arial"/>
-          <w:sz w:val="17"/>
-        </w:rPr>
-        <w:t>Full SDLC, Test-Driven Development (TDD), Causal Evaluation, API Observability, Agile Collaboration, Microservices, Documentation</w:t>
+        <w:t>FastAPI, Flask, RESTful APIs, WebSockets, PostgreSQL, Supabase, MySQL, Docker, pytest, CI/CD, Postman</w:t>
       </w:r>
     </w:p>
     <w:p>
@@ -255,7 +203,7 @@
           <w:rFonts w:ascii="Arial" w:hAnsi="Arial"/>
           <w:sz w:val="17"/>
         </w:rPr>
-        <w:t>Architected end-to-end predictive analytics pipeline for centrifugal compressor Condition-Based Monitoring (CBM) across 3 industrial facilities and 4,000+ daily historian records.</w:t>
+        <w:t>Engineered predictive Condition-Based Monitoring (CBM) pipeline processing 4,000+ daily historian records across 3 industrial facilities, reconciling multi-stage thermodynamics.</w:t>
       </w:r>
     </w:p>
     <w:p>
@@ -268,7 +216,7 @@
           <w:rFonts w:ascii="Arial" w:hAnsi="Arial"/>
           <w:sz w:val="17"/>
         </w:rPr>
-        <w:t>Reproduced 3,879 historical Degradation Factor Index (DFI) rows to &lt;1e-10 absolute error; engineered causal maintenance-event logic with 17/17 regression checks passing.</w:t>
+        <w:t>Reproduced 3,879 historical Degradation Factor Index (DFI) records to &lt;1e-10 absolute error against plant baseline; formulated causal maintenance-reset logic validated across 17 automated regression gates.</w:t>
       </w:r>
     </w:p>
     <w:p>
@@ -281,7 +229,7 @@
           <w:rFonts w:ascii="Arial" w:hAnsi="Arial"/>
           <w:sz w:val="17"/>
         </w:rPr>
-        <w:t>Built and containerized REST inference microservices in Docker with Flask, automating anomaly detection alerts with structured API responses.</w:t>
+        <w:t>Containerized Flask REST inference microservices with Docker, delivering sub-second anomaly detection and thermodynamic fouling score endpoints.</w:t>
       </w:r>
     </w:p>
     <w:p>
@@ -294,7 +242,7 @@
           <w:rFonts w:ascii="Arial" w:hAnsi="Arial"/>
           <w:sz w:val="17"/>
         </w:rPr>
-        <w:t>Audited 400+ physical and mechanical process variables, evaluated ML vs. statistical forecasting baselines, and instituted automated promotion gates for model deployment.</w:t>
+        <w:t>Audited 400+ physical and mechanical process variables, evaluating ML models against Holt damped-trend statistical baselines; instituted automated CV promotion gates that halted ungrounded maintenance alerts.</w:t>
       </w:r>
     </w:p>
     <w:p>
@@ -337,7 +285,7 @@
           <w:rFonts w:ascii="Arial" w:hAnsi="Arial"/>
           <w:sz w:val="17"/>
         </w:rPr>
-        <w:t>Engineered high-throughput RESTful backend APIs and database schemas with FastAPI and PostgreSQL for an institutional food operations and cost-management platform (Sodexo).</w:t>
+        <w:t>Developed RESTful backend APIs and relational database schemas with FastAPI and PostgreSQL for an institutional food operations and cost-management platform (serving 1,200+ daily meals).</w:t>
       </w:r>
     </w:p>
     <w:p>
@@ -350,7 +298,7 @@
           <w:rFonts w:ascii="Arial" w:hAnsi="Arial"/>
           <w:sz w:val="17"/>
         </w:rPr>
-        <w:t>Developed end-to-end automated workflows for menu generation, Bill-of-Materials (BOM) cost calculations, live inventory tracking, and operator dashboards.</w:t>
+        <w:t>Automated weekly menu planning and multi-tier Bill-of-Materials (BOM) ingredient rollups, eliminating manual inventory calculation overhead.</w:t>
       </w:r>
     </w:p>
     <w:p>
@@ -363,7 +311,7 @@
           <w:rFonts w:ascii="Arial" w:hAnsi="Arial"/>
           <w:sz w:val="17"/>
         </w:rPr>
-        <w:t>Integrated a Random Forest predictive attendance model into operational shift scheduling, achieving 88% forecast accuracy across workforce shifts.</w:t>
+        <w:t>Trained a Random Forest meal-attendance forecaster incorporating weather, calendar events, and shift historical trends, achieving 88% accuracy (within ±10% headcount margin) and outperforming rolling-average baselines by 14%.</w:t>
       </w:r>
     </w:p>
     <w:p>
@@ -376,7 +324,7 @@
           <w:rFonts w:ascii="Arial" w:hAnsi="Arial"/>
           <w:sz w:val="17"/>
         </w:rPr>
-        <w:t>Implemented comprehensive test suites with pytest, executed schema migrations, and collaborated on code reviews using Git and GitHub workflows.</w:t>
+        <w:t>Maintained 85%+ backend test coverage with pytest, executed Alembic database schema migrations, and collaborated on code reviews using Git pull-request workflows.</w:t>
       </w:r>
     </w:p>
     <w:p>
@@ -408,7 +356,7 @@
           <w:b/>
           <w:sz w:val="18"/>
         </w:rPr>
-        <w:t>Project Aegis - Autonomous Multi-Agent Triage System</w:t>
+        <w:t>Project Aegis - Autonomous Multi-Agent Threat Intelligence System</w:t>
       </w:r>
       <w:r>
         <w:rPr>
@@ -416,7 +364,7 @@
           <w:i/>
           <w:sz w:val="16"/>
         </w:rPr>
-        <w:t xml:space="preserve"> | Python, FastAPI, Agentic AI, RAG, Supabase (pgvector), Docker</w:t>
+        <w:t xml:space="preserve"> | Python, FastAPI, Multi-Agent Swarms, Gemini API, RAG, Supabase (pgvector), Docker</w:t>
       </w:r>
     </w:p>
     <w:p>
@@ -467,7 +415,7 @@
           <w:rFonts w:ascii="Arial" w:hAnsi="Arial"/>
           <w:sz w:val="17"/>
         </w:rPr>
-        <w:t>Built a multi-agent incident-triage and response simulation with hybrid RAG retrieval and tool-calling agent swarms, enforcing strict JSON Schema validation for deterministic structured outputs.</w:t>
+        <w:t>Architected a decoupled two-stage agentic swarm (Research Agent -&gt; Investigator Agent) enforcing strict JSON Schema validation, achieving 100% structured parsing reliability across model retries.</w:t>
       </w:r>
     </w:p>
     <w:p>
@@ -480,7 +428,7 @@
           <w:rFonts w:ascii="Arial" w:hAnsi="Arial"/>
           <w:sz w:val="17"/>
         </w:rPr>
-        <w:t>Engineered tool-calling agent workflows to autonomously query incident records, evaluate severity levels, and route prioritized response actions across the multi-agent pipeline.</w:t>
+        <w:t>Engineered quantitative market anomaly detection (Scout Agent) computing 5-day rolling Z-scores on price/volume spikes via Yahoo Finance proxies, distinguishing organic volatility from coordinated disinformation attacks.</w:t>
       </w:r>
     </w:p>
     <w:p>
@@ -493,7 +441,7 @@
           <w:rFonts w:ascii="Arial" w:hAnsi="Arial"/>
           <w:sz w:val="17"/>
         </w:rPr>
-        <w:t>Implemented semantic vector persistence via Supabase (pgvector), API-key isolation, and structured audit trails for agent-to-agent message passing and event reporting.</w:t>
+        <w:t>Implemented canonical SHA-256 claim deduplication to eliminate redundant LLM token spend (0ms cached recall), coupled with Supabase pgvector semantic retrieval and auditable verdict logs.</w:t>
       </w:r>
     </w:p>
     <w:p>
@@ -507,7 +455,7 @@
           <w:b/>
           <w:sz w:val="18"/>
         </w:rPr>
-        <w:t>Gridium Protocol - Multi-Agent Microgrid Optimization</w:t>
+        <w:t>TopoFlow - GNN Permeability &amp; Micro-CT Pore Network Benchmark</w:t>
       </w:r>
       <w:r>
         <w:rPr>
@@ -515,7 +463,90 @@
           <w:i/>
           <w:sz w:val="16"/>
         </w:rPr>
-        <w:t xml:space="preserve"> | Python, PyTorch, FastAPI, DDPG, WebSockets</w:t>
+        <w:t xml:space="preserve"> | Python, PyTorch Geometric, GraphSAGE, OpenPNM, FastAPI</w:t>
+      </w:r>
+    </w:p>
+    <w:p>
+      <w:pPr>
+        <w:spacing w:before="0" w:after="20" w:line="264" w:lineRule="auto"/>
+        <w:jc w:val="left"/>
+      </w:pPr>
+      <w:r>
+        <w:rPr>
+          <w:rFonts w:ascii="Arial" w:hAnsi="Arial"/>
+          <w:b/>
+          <w:sz w:val="16"/>
+        </w:rPr>
+        <w:t xml:space="preserve">Source Code: </w:t>
+      </w:r>
+      <w:r>
+        <w:rPr>
+          <w:rFonts w:ascii="Arial" w:hAnsi="Arial"/>
+          <w:sz w:val="16"/>
+          <w:u w:val="single"/>
+        </w:rPr>
+        <w:t xml:space="preserve">https://github.com/Shaunakrane914/Flow   </w:t>
+      </w:r>
+    </w:p>
+    <w:p>
+      <w:pPr>
+        <w:pStyle w:val="ListBullet"/>
+        <w:spacing w:before="0" w:after="20" w:line="276" w:lineRule="auto"/>
+      </w:pPr>
+      <w:r>
+        <w:rPr>
+          <w:rFonts w:ascii="Arial" w:hAnsi="Arial"/>
+          <w:sz w:val="17"/>
+        </w:rPr>
+        <w:t>Benchmarked GraphSAGE against classical Kozeny-Carman physics baselines across 1,231 micro-CT pore networks from 5 geological formations, establishing an empirical regime threshold (Cv) for when graph topology outperforms bulk equations.</w:t>
+      </w:r>
+    </w:p>
+    <w:p>
+      <w:pPr>
+        <w:pStyle w:val="ListBullet"/>
+        <w:spacing w:before="0" w:after="20" w:line="276" w:lineRule="auto"/>
+      </w:pPr>
+      <w:r>
+        <w:rPr>
+          <w:rFonts w:ascii="Arial" w:hAnsi="Arial"/>
+          <w:sz w:val="17"/>
+        </w:rPr>
+        <w:t>Achieved 46.2% MSE reduction on heterogeneous Savonnières carbonate and 28.4% on Estaillades formations over classical solvers, while identifying that homogeneous sandstones remain better predicted by classical physics.</w:t>
+      </w:r>
+    </w:p>
+    <w:p>
+      <w:pPr>
+        <w:pStyle w:val="ListBullet"/>
+        <w:spacing w:before="0" w:after="20" w:line="276" w:lineRule="auto"/>
+      </w:pPr>
+      <w:r>
+        <w:rPr>
+          <w:rFonts w:ascii="Arial" w:hAnsi="Arial"/>
+          <w:sz w:val="17"/>
+        </w:rPr>
+        <w:t>Built end-to-end pore-network extraction pipeline (PoreSpy/SNOW2), GNN model training workflows in PyTorch Geometric, and streaming FastAPI inference endpoints with SSE.</w:t>
+      </w:r>
+    </w:p>
+    <w:p>
+      <w:pPr>
+        <w:spacing w:before="40" w:after="10" w:line="264" w:lineRule="auto"/>
+        <w:jc w:val="left"/>
+      </w:pPr>
+      <w:r>
+        <w:rPr>
+          <w:rFonts w:ascii="Arial" w:hAnsi="Arial"/>
+          <w:b/>
+          <w:sz w:val="18"/>
+        </w:rPr>
+        <w:t>Gridium Protocol - Autonomous Microgrid Optimization &amp; DePIN Market</w:t>
+      </w:r>
+      <w:r>
+        <w:rPr>
+          <w:rFonts w:ascii="Arial" w:hAnsi="Arial"/>
+          <w:i/>
+          <w:sz w:val="16"/>
+        </w:rPr>
+        <w:t xml:space="preserve"> | Python, PyTorch, DDPG, FastAPI, WebSockets, Solidity, Circom</w:t>
       </w:r>
     </w:p>
     <w:p>
@@ -566,7 +597,7 @@
           <w:rFonts w:ascii="Arial" w:hAnsi="Arial"/>
           <w:sz w:val="17"/>
         </w:rPr>
-        <w:t>Developed a multi-agent reinforcement learning engine utilizing Deep Deterministic Policy Gradients (DDPG) to dynamically optimize power routing across a 15-node simulated microgrid.</w:t>
+        <w:t>Developed a continuous-control reinforcement learning engine (PyTorch DDPG) in a custom 15-node Ohm's law Gymnasium microgrid (AegisEnv), dynamically adjusting AMM swap fees (0.10%-5.00%) to mitigate solar duck-curve volatility.</w:t>
       </w:r>
     </w:p>
     <w:p>
@@ -579,7 +610,7 @@
           <w:rFonts w:ascii="Arial" w:hAnsi="Arial"/>
           <w:sz w:val="17"/>
         </w:rPr>
-        <w:t>Coordinated decentralized agent policies managing solar generation, battery storage, and dynamic loads, achieving an 18.4% reduction in peak-hour grid strain in simulation.</w:t>
+        <w:t>Reduced peak-hour grid strain by 18.4% compared to static flat-fee and rule-based fixed-tariff baselines across simulated multi-node solar generation and battery demand cycles.</w:t>
       </w:r>
     </w:p>
     <w:p>
@@ -592,90 +623,7 @@
           <w:rFonts w:ascii="Arial" w:hAnsi="Arial"/>
           <w:sz w:val="17"/>
         </w:rPr>
-        <w:t>Built real-time telemetry streaming pipelines using FastAPI and WebSockets, feeding continuous operational metrics to interactive monitoring dashboards.</w:t>
-      </w:r>
-    </w:p>
-    <w:p>
-      <w:pPr>
-        <w:spacing w:before="40" w:after="10" w:line="264" w:lineRule="auto"/>
-        <w:jc w:val="left"/>
-      </w:pPr>
-      <w:r>
-        <w:rPr>
-          <w:rFonts w:ascii="Arial" w:hAnsi="Arial"/>
-          <w:b/>
-          <w:sz w:val="18"/>
-        </w:rPr>
-        <w:t>TopoFlow - GNN Fluid Dynamics Simulation</w:t>
-      </w:r>
-      <w:r>
-        <w:rPr>
-          <w:rFonts w:ascii="Arial" w:hAnsi="Arial"/>
-          <w:i/>
-          <w:sz w:val="16"/>
-        </w:rPr>
-        <w:t xml:space="preserve"> | Python, PyTorch Geometric, GraphSAGE, FastAPI</w:t>
-      </w:r>
-    </w:p>
-    <w:p>
-      <w:pPr>
-        <w:spacing w:before="0" w:after="20" w:line="264" w:lineRule="auto"/>
-        <w:jc w:val="left"/>
-      </w:pPr>
-      <w:r>
-        <w:rPr>
-          <w:rFonts w:ascii="Arial" w:hAnsi="Arial"/>
-          <w:b/>
-          <w:sz w:val="16"/>
-        </w:rPr>
-        <w:t xml:space="preserve">Source Code: </w:t>
-      </w:r>
-      <w:r>
-        <w:rPr>
-          <w:rFonts w:ascii="Arial" w:hAnsi="Arial"/>
-          <w:sz w:val="16"/>
-          <w:u w:val="single"/>
-        </w:rPr>
-        <w:t xml:space="preserve">https://github.com/Shaunakrane914/Flow   </w:t>
-      </w:r>
-    </w:p>
-    <w:p>
-      <w:pPr>
-        <w:pStyle w:val="ListBullet"/>
-        <w:spacing w:before="0" w:after="20" w:line="276" w:lineRule="auto"/>
-      </w:pPr>
-      <w:r>
-        <w:rPr>
-          <w:rFonts w:ascii="Arial" w:hAnsi="Arial"/>
-          <w:sz w:val="17"/>
-        </w:rPr>
-        <w:t>Benchmarked GraphSAGE against Kozeny-Carman physics baselines across 1,231 pore-network samples from 5 geological formations, using pore-size heterogeneity to dictate the modeling regime.</w:t>
-      </w:r>
-    </w:p>
-    <w:p>
-      <w:pPr>
-        <w:pStyle w:val="ListBullet"/>
-        <w:spacing w:before="0" w:after="20" w:line="276" w:lineRule="auto"/>
-      </w:pPr>
-      <w:r>
-        <w:rPr>
-          <w:rFonts w:ascii="Arial" w:hAnsi="Arial"/>
-          <w:sz w:val="17"/>
-        </w:rPr>
-        <w:t>Reduced MSE loss by 46.2% on Savonnieres and 28.4% on Estaillades formations while maintaining rigorous physical consistency benchmarks across baseline solvers.</w:t>
-      </w:r>
-    </w:p>
-    <w:p>
-      <w:pPr>
-        <w:pStyle w:val="ListBullet"/>
-        <w:spacing w:before="0" w:after="20" w:line="276" w:lineRule="auto"/>
-      </w:pPr>
-      <w:r>
-        <w:rPr>
-          <w:rFonts w:ascii="Arial" w:hAnsi="Arial"/>
-          <w:sz w:val="17"/>
-        </w:rPr>
-        <w:t>Engineered pore-network extraction pipelines, GNN model training workflows, and FastAPI inference microservices with PyTorch Geometric.</w:t>
+        <w:t>Engineered 500ms Socket.io telemetry gateway, Solidity constant-product AMM contract (x * y = k) with reentrancy protection, and Groth16 zk-SNARK circuits proving energy surplus off-chain.</w:t>
       </w:r>
     </w:p>
     <w:p>

</xml_diff>

<commit_message>
refactor(resume): remove references to Gemini, OpenAI APIs, TypeScript, and JavaScript
</commit_message>
<xml_diff>
--- a/Shaunak_Rane_Resume.docx
+++ b/Shaunak_Rane_Resume.docx
@@ -79,7 +79,7 @@
           <w:rFonts w:ascii="Arial" w:hAnsi="Arial"/>
           <w:sz w:val="17"/>
         </w:rPr>
-        <w:t>Python, C, SQL, TypeScript/JavaScript, Bash, Linux, Git</w:t>
+        <w:t>Python, C, SQL, Bash, Linux, Git</w:t>
       </w:r>
     </w:p>
     <w:p>
@@ -100,7 +100,7 @@
           <w:rFonts w:ascii="Arial" w:hAnsi="Arial"/>
           <w:sz w:val="17"/>
         </w:rPr>
-        <w:t>Multi-Agent Workflows, RAG Architecture, Tool &amp; Function Calling, Structured Outputs (JSON Schema), Vector Embeddings (pgvector), Prompt Engineering, Gemini &amp; OpenAI APIs</w:t>
+        <w:t>Multi-Agent Workflows, RAG Architecture, Tool &amp; Function Calling, Structured Outputs (JSON Schema), Vector Embeddings (pgvector), Prompt Engineering</w:t>
       </w:r>
     </w:p>
     <w:p>
@@ -364,7 +364,7 @@
           <w:i/>
           <w:sz w:val="16"/>
         </w:rPr>
-        <w:t xml:space="preserve"> | Python, FastAPI, Multi-Agent Swarms, Gemini API, RAG, Supabase (pgvector), Docker</w:t>
+        <w:t xml:space="preserve"> | Python, FastAPI, Multi-Agent Swarms, Agentic AI, RAG, Supabase (pgvector), Docker</w:t>
       </w:r>
     </w:p>
     <w:p>

</xml_diff>

<commit_message>
feat(resume): tailor resume for Zscaler SDE internship requirements
</commit_message>
<xml_diff>
--- a/Shaunak_Rane_Resume.docx
+++ b/Shaunak_Rane_Resume.docx
@@ -27,7 +27,7 @@
           <w:b/>
           <w:sz w:val="19"/>
         </w:rPr>
-        <w:t>AI/ML Engineer | Backend &amp; LLM Systems | Python | FastAPI</w:t>
+        <w:t>Software Engineering | Python | Backend Systems | AI/ML</w:t>
       </w:r>
     </w:p>
     <w:p>
@@ -40,7 +40,90 @@
           <w:rFonts w:ascii="Arial" w:hAnsi="Arial"/>
           <w:sz w:val="17"/>
         </w:rPr>
-        <w:t>Thane, Maharashtra, India | +91 93202 21211 | shaunakrane914@gmail.com | linkedin.com/in/shaunak-rane-3980582ba | github.com/Shaunakrane914 | shaunakrane.is-a.dev</w:t>
+        <w:t>Thane, India | +91 93202 21211 | shaunakrane914@gmail.com | linkedin.com/in/shaunak-rane | github.com/Shaunakrane914 | shaunak-rane.pages.dev</w:t>
+      </w:r>
+    </w:p>
+    <w:p>
+      <w:pPr>
+        <w:spacing w:before="90" w:after="40" w:line="264" w:lineRule="auto"/>
+        <w:jc w:val="left"/>
+        <w:pBdr>
+          <w:bottom w:val="single" w:sz="6" w:space="1" w:color="000000"/>
+        </w:pBdr>
+      </w:pPr>
+      <w:r>
+        <w:rPr>
+          <w:rFonts w:ascii="Arial" w:hAnsi="Arial"/>
+          <w:b/>
+          <w:color w:val="000000"/>
+          <w:sz w:val="19"/>
+        </w:rPr>
+        <w:t>EDUCATION</w:t>
+      </w:r>
+    </w:p>
+    <w:p>
+      <w:pPr>
+        <w:spacing w:before="40" w:after="20" w:line="264" w:lineRule="auto"/>
+        <w:jc w:val="left"/>
+      </w:pPr>
+      <w:r>
+        <w:rPr>
+          <w:rFonts w:ascii="Arial" w:hAnsi="Arial"/>
+          <w:b/>
+          <w:sz w:val="18"/>
+        </w:rPr>
+        <w:t>Universal AI University</w:t>
+      </w:r>
+      <w:r>
+        <w:rPr>
+          <w:rFonts w:ascii="Arial" w:hAnsi="Arial"/>
+          <w:sz w:val="18"/>
+        </w:rPr>
+        <w:t xml:space="preserve"> - B.Tech in Artificial Intelligence &amp; Machine Learning</w:t>
+      </w:r>
+      <w:r>
+        <w:rPr>
+          <w:rFonts w:ascii="Arial" w:hAnsi="Arial"/>
+          <w:b/>
+          <w:sz w:val="16"/>
+        </w:rPr>
+        <w:t xml:space="preserve">       (Expected May 2028 | Karjat, Maharashtra)</w:t>
+      </w:r>
+    </w:p>
+    <w:p>
+      <w:pPr>
+        <w:pStyle w:val="ListBullet"/>
+        <w:spacing w:before="0" w:after="20"/>
+      </w:pPr>
+      <w:r>
+        <w:rPr>
+          <w:rFonts w:ascii="Arial" w:hAnsi="Arial"/>
+          <w:b/>
+          <w:sz w:val="17"/>
+        </w:rPr>
+        <w:t xml:space="preserve">CGPA: </w:t>
+      </w:r>
+      <w:r>
+        <w:rPr>
+          <w:rFonts w:ascii="Arial" w:hAnsi="Arial"/>
+          <w:b/>
+          <w:sz w:val="17"/>
+        </w:rPr>
+        <w:t>8.47 / 10.0</w:t>
+      </w:r>
+      <w:r>
+        <w:rPr>
+          <w:rFonts w:ascii="Arial" w:hAnsi="Arial"/>
+          <w:sz w:val="17"/>
+        </w:rPr>
+        <w:t xml:space="preserve">   |   Relevant Coursework: </w:t>
+      </w:r>
+      <w:r>
+        <w:rPr>
+          <w:rFonts w:ascii="Arial" w:hAnsi="Arial"/>
+          <w:sz w:val="17"/>
+        </w:rPr>
+        <w:t>Data Structures &amp; Algorithms, Object-Oriented Programming, Operating Systems, DBMS, Computer Networks, System Design.</w:t>
       </w:r>
     </w:p>
     <w:p>
@@ -79,7 +162,7 @@
           <w:rFonts w:ascii="Arial" w:hAnsi="Arial"/>
           <w:sz w:val="17"/>
         </w:rPr>
-        <w:t>Python, C, SQL, Bash, Linux, Git</w:t>
+        <w:t>Python, C, SQL, Bash, Git, Linux (CLI, Scripting)</w:t>
       </w:r>
     </w:p>
     <w:p>
@@ -93,14 +176,14 @@
           <w:b/>
           <w:sz w:val="17"/>
         </w:rPr>
-        <w:t xml:space="preserve">AI &amp; LLM Systems: </w:t>
+        <w:t xml:space="preserve">Backend &amp; Infrastructure: </w:t>
       </w:r>
       <w:r>
         <w:rPr>
           <w:rFonts w:ascii="Arial" w:hAnsi="Arial"/>
           <w:sz w:val="17"/>
         </w:rPr>
-        <w:t>Multi-Agent Workflows, RAG Architecture, Tool &amp; Function Calling, Structured Outputs (JSON Schema), Vector Embeddings (pgvector), Prompt Engineering</w:t>
+        <w:t>FastAPI, Flask, RESTful APIs, WebSockets, PostgreSQL, Supabase, MySQL, Docker, Linux Internals</w:t>
       </w:r>
     </w:p>
     <w:p>
@@ -114,14 +197,14 @@
           <w:b/>
           <w:sz w:val="17"/>
         </w:rPr>
-        <w:t xml:space="preserve">Machine Learning &amp; Data: </w:t>
+        <w:t xml:space="preserve">Software Engineering: </w:t>
       </w:r>
       <w:r>
         <w:rPr>
           <w:rFonts w:ascii="Arial" w:hAnsi="Arial"/>
           <w:sz w:val="17"/>
         </w:rPr>
-        <w:t>PyTorch, PyTorch Geometric, GraphSAGE, Scikit-learn, Statsmodels, NumPy, Pandas, Time-Series Modeling, Anomaly Detection, Cross-Validation</w:t>
+        <w:t>Data Structures &amp; Algorithms (DSA), OOP, pytest (Unit &amp; Integration Testing), Alembic (Schema Migrations), CI/CD</w:t>
       </w:r>
     </w:p>
     <w:p>
@@ -135,14 +218,14 @@
           <w:b/>
           <w:sz w:val="17"/>
         </w:rPr>
-        <w:t xml:space="preserve">Backend &amp; Cloud/DevOps: </w:t>
+        <w:t xml:space="preserve">AI &amp; Intelligent Systems: </w:t>
       </w:r>
       <w:r>
         <w:rPr>
           <w:rFonts w:ascii="Arial" w:hAnsi="Arial"/>
           <w:sz w:val="17"/>
         </w:rPr>
-        <w:t>FastAPI, Flask, RESTful APIs, WebSockets, PostgreSQL, Supabase, MySQL, Docker, pytest, CI/CD, Postman</w:t>
+        <w:t>Multi-Agent Workflows, RAG Architecture, PyTorch, PyTorch Geometric, Vector Embeddings (pgvector), Time-Series Modeling</w:t>
       </w:r>
     </w:p>
     <w:p>
@@ -182,7 +265,7 @@
           <w:i/>
           <w:sz w:val="18"/>
         </w:rPr>
-        <w:t xml:space="preserve"> - AI Engineering Intern</w:t>
+        <w:t xml:space="preserve"> - AI &amp; Systems Engineering Intern</w:t>
       </w:r>
       <w:r>
         <w:rPr>
@@ -190,7 +273,7 @@
           <w:b/>
           <w:sz w:val="16"/>
         </w:rPr>
-        <w:t xml:space="preserve">       (May 2026 - Aug 2026 | Thane, India (Remote))</w:t>
+        <w:t xml:space="preserve">       (May 2026 - Aug 2026 | Remote)</w:t>
       </w:r>
     </w:p>
     <w:p>
@@ -203,7 +286,7 @@
           <w:rFonts w:ascii="Arial" w:hAnsi="Arial"/>
           <w:sz w:val="17"/>
         </w:rPr>
-        <w:t>Engineered predictive Condition-Based Monitoring (CBM) pipeline processing 4,000+ daily historian records across 3 industrial facilities, reconciling multi-stage thermodynamics.</w:t>
+        <w:t>Engineered predictive Condition-Based Monitoring (CBM) pipeline processing 4,000+ daily historian records across 3 industrial plants, reconciling multi-stage thermodynamics.</w:t>
       </w:r>
     </w:p>
     <w:p>
@@ -216,7 +299,7 @@
           <w:rFonts w:ascii="Arial" w:hAnsi="Arial"/>
           <w:sz w:val="17"/>
         </w:rPr>
-        <w:t>Reproduced 3,879 historical Degradation Factor Index (DFI) records to &lt;1e-10 absolute error against plant baseline; formulated causal maintenance-reset logic validated across 17 automated regression gates.</w:t>
+        <w:t>Re-implemented historical Degradation Factor Index (DFI) models across 3,879 historian logs with numerical convergence (&lt;1e-10 residual vs baseline); formulated deterministic maintenance-reset logic validated across 17 automated regression test gates.</w:t>
       </w:r>
     </w:p>
     <w:p>
@@ -229,7 +312,7 @@
           <w:rFonts w:ascii="Arial" w:hAnsi="Arial"/>
           <w:sz w:val="17"/>
         </w:rPr>
-        <w:t>Containerized Flask REST inference microservices with Docker, delivering sub-second anomaly detection and thermodynamic fouling score endpoints.</w:t>
+        <w:t>Containerized Flask REST inference microservices with Docker for edge deployment, delivering sub-second anomaly detection and thermodynamic scoring endpoints.</w:t>
       </w:r>
     </w:p>
     <w:p>
@@ -272,7 +355,7 @@
           <w:b/>
           <w:sz w:val="16"/>
         </w:rPr>
-        <w:t xml:space="preserve">       (Apr 2025 - Jul 2025 | Thane, India (Remote))</w:t>
+        <w:t xml:space="preserve">       (Apr 2025 - Jul 2025 | Remote)</w:t>
       </w:r>
     </w:p>
     <w:p>
@@ -285,7 +368,7 @@
           <w:rFonts w:ascii="Arial" w:hAnsi="Arial"/>
           <w:sz w:val="17"/>
         </w:rPr>
-        <w:t>Developed RESTful backend APIs and relational database schemas with FastAPI and PostgreSQL for an institutional food operations and cost-management platform (serving 1,200+ daily meals).</w:t>
+        <w:t>Developed RESTful backend APIs and normalized relational PostgreSQL database schemas with FastAPI for an institutional food operations and cost-management platform (serving 1,200+ daily meals).</w:t>
       </w:r>
     </w:p>
     <w:p>
@@ -311,7 +394,7 @@
           <w:rFonts w:ascii="Arial" w:hAnsi="Arial"/>
           <w:sz w:val="17"/>
         </w:rPr>
-        <w:t>Trained a Random Forest meal-attendance forecaster incorporating weather, calendar events, and shift historical trends, achieving 88% accuracy (within ±10% headcount margin) and outperforming rolling-average baselines by 14%.</w:t>
+        <w:t>Trained a Random Forest meal-attendance forecaster incorporating weather, calendar events, and shift historical trends, achieving 88% accuracy (within ±10% margin) and outperforming rolling baselines by 14%.</w:t>
       </w:r>
     </w:p>
     <w:p>
@@ -356,7 +439,7 @@
           <w:b/>
           <w:sz w:val="18"/>
         </w:rPr>
-        <w:t>Project Aegis - Autonomous Multi-Agent Threat Intelligence System</w:t>
+        <w:t>Project Aegis - Threat Intelligence &amp; Claim Verification Engine</w:t>
       </w:r>
       <w:r>
         <w:rPr>
@@ -364,7 +447,7 @@
           <w:i/>
           <w:sz w:val="16"/>
         </w:rPr>
-        <w:t xml:space="preserve"> | Python, FastAPI, Multi-Agent Swarms, Agentic AI, RAG, Supabase (pgvector), Docker</w:t>
+        <w:t xml:space="preserve"> | Python, FastAPI, Multi-Agent Swarms, RAG, pgvector, Docker</w:t>
       </w:r>
     </w:p>
     <w:p>
@@ -415,7 +498,7 @@
           <w:rFonts w:ascii="Arial" w:hAnsi="Arial"/>
           <w:sz w:val="17"/>
         </w:rPr>
-        <w:t>Architected a decoupled two-stage agentic swarm (Research Agent -&gt; Investigator Agent) enforcing strict JSON Schema validation, achieving 100% structured parsing reliability across model retries.</w:t>
+        <w:t>Architected decoupled multi-agent verification pipeline (Scout -&gt; Research -&gt; Investigator) enforcing strict Pydantic JSON Schema validation, achieving zero unhandled schema errors across benchmark test suites via automated retry policies.</w:t>
       </w:r>
     </w:p>
     <w:p>
@@ -428,7 +511,7 @@
           <w:rFonts w:ascii="Arial" w:hAnsi="Arial"/>
           <w:sz w:val="17"/>
         </w:rPr>
-        <w:t>Engineered quantitative market anomaly detection (Scout Agent) computing 5-day rolling Z-scores on price/volume spikes via Yahoo Finance proxies, distinguishing organic volatility from coordinated disinformation attacks.</w:t>
+        <w:t>Engineered quantitative market anomaly detection (Scout Agent) computing 5-day rolling Z-scores on price/volume telemetry via Yahoo Finance proxies to isolate abnormal spikes.</w:t>
       </w:r>
     </w:p>
     <w:p>
@@ -441,7 +524,7 @@
           <w:rFonts w:ascii="Arial" w:hAnsi="Arial"/>
           <w:sz w:val="17"/>
         </w:rPr>
-        <w:t>Implemented canonical SHA-256 claim deduplication to eliminate redundant LLM token spend (0ms cached recall), coupled with Supabase pgvector semantic retrieval and auditable verdict logs.</w:t>
+        <w:t>Implemented canonical SHA-256 claim hashing for sub-millisecond in-memory cache deduplication, preventing redundant LLM token spend, paired with Supabase pgvector semantic retrieval and auditable verdict trails.</w:t>
       </w:r>
     </w:p>
     <w:p>
@@ -538,7 +621,7 @@
           <w:b/>
           <w:sz w:val="18"/>
         </w:rPr>
-        <w:t>Gridium Protocol - Autonomous Microgrid Optimization &amp; DePIN Market</w:t>
+        <w:t>Gridium Protocol - Autonomous Microgrid Optimization &amp; Telemetry</w:t>
       </w:r>
       <w:r>
         <w:rPr>
@@ -597,7 +680,7 @@
           <w:rFonts w:ascii="Arial" w:hAnsi="Arial"/>
           <w:sz w:val="17"/>
         </w:rPr>
-        <w:t>Developed a continuous-control reinforcement learning engine (PyTorch DDPG) in a custom 15-node Ohm's law Gymnasium microgrid (AegisEnv), dynamically adjusting AMM swap fees (0.10%-5.00%) to mitigate solar duck-curve volatility.</w:t>
+        <w:t>Developed continuous-control reinforcement learning engine (PyTorch DDPG) in a custom 15-node Ohm's law Gymnasium microgrid (AegisEnv), dynamically adjusting AMM swap fees (0.10%-5.00%) to mitigate solar duck-curve volatility.</w:t>
       </w:r>
     </w:p>
     <w:p>
@@ -624,89 +707,6 @@
           <w:sz w:val="17"/>
         </w:rPr>
         <w:t>Engineered 500ms Socket.io telemetry gateway, Solidity constant-product AMM contract (x * y = k) with reentrancy protection, and Groth16 zk-SNARK circuits proving energy surplus off-chain.</w:t>
-      </w:r>
-    </w:p>
-    <w:p>
-      <w:pPr>
-        <w:spacing w:before="90" w:after="40" w:line="264" w:lineRule="auto"/>
-        <w:jc w:val="left"/>
-        <w:pBdr>
-          <w:bottom w:val="single" w:sz="6" w:space="1" w:color="000000"/>
-        </w:pBdr>
-      </w:pPr>
-      <w:r>
-        <w:rPr>
-          <w:rFonts w:ascii="Arial" w:hAnsi="Arial"/>
-          <w:b/>
-          <w:color w:val="000000"/>
-          <w:sz w:val="19"/>
-        </w:rPr>
-        <w:t>EDUCATION</w:t>
-      </w:r>
-    </w:p>
-    <w:p>
-      <w:pPr>
-        <w:spacing w:before="40" w:after="20" w:line="264" w:lineRule="auto"/>
-        <w:jc w:val="left"/>
-      </w:pPr>
-      <w:r>
-        <w:rPr>
-          <w:rFonts w:ascii="Arial" w:hAnsi="Arial"/>
-          <w:b/>
-          <w:sz w:val="18"/>
-        </w:rPr>
-        <w:t>Universal AI University</w:t>
-      </w:r>
-      <w:r>
-        <w:rPr>
-          <w:rFonts w:ascii="Arial" w:hAnsi="Arial"/>
-          <w:sz w:val="18"/>
-        </w:rPr>
-        <w:t xml:space="preserve"> - B.Tech in Artificial Intelligence &amp; Machine Learning</w:t>
-      </w:r>
-      <w:r>
-        <w:rPr>
-          <w:rFonts w:ascii="Arial" w:hAnsi="Arial"/>
-          <w:b/>
-          <w:sz w:val="16"/>
-        </w:rPr>
-        <w:t xml:space="preserve">       (Expected May 2028 | Karjat, Maharashtra)</w:t>
-      </w:r>
-    </w:p>
-    <w:p>
-      <w:pPr>
-        <w:pStyle w:val="ListBullet"/>
-        <w:spacing w:before="0" w:after="20"/>
-      </w:pPr>
-      <w:r>
-        <w:rPr>
-          <w:rFonts w:ascii="Arial" w:hAnsi="Arial"/>
-          <w:b/>
-          <w:sz w:val="17"/>
-        </w:rPr>
-        <w:t xml:space="preserve">CGPA: </w:t>
-      </w:r>
-      <w:r>
-        <w:rPr>
-          <w:rFonts w:ascii="Arial" w:hAnsi="Arial"/>
-          <w:b/>
-          <w:sz w:val="17"/>
-        </w:rPr>
-        <w:t>8.47</w:t>
-      </w:r>
-      <w:r>
-        <w:rPr>
-          <w:rFonts w:ascii="Arial" w:hAnsi="Arial"/>
-          <w:sz w:val="17"/>
-        </w:rPr>
-        <w:t xml:space="preserve">   |   Relevant Coursework: </w:t>
-      </w:r>
-      <w:r>
-        <w:rPr>
-          <w:rFonts w:ascii="Arial" w:hAnsi="Arial"/>
-          <w:sz w:val="17"/>
-        </w:rPr>
-        <w:t>Data Structures &amp; Algorithms, Object-Oriented Programming, Machine Learning, Deep Learning, DBMS, Operating Systems, Linear Algebra &amp; Probability.</w:t>
       </w:r>
     </w:p>
     <w:sectPr>

</xml_diff>